<commit_message>
Rewrite Kraken CV in Jessie's register
Her bullets are verb, what, numbers. The previous version added
explanatory subclauses ("defining what each would prove, which segments
it covered and when to stop it") and carried [ADD:] annotations inside
the bullets themselves. Both are gone.

Also drops the dissertation mark from Education to match her own
formatting, and reorders Skills into AI & automation, Testing &
measurement, Operations, Marketing workflows.

The three gaps that decide this screen now live in OPEN-QUESTIONS.md and
on the published page, not in the document.

Verified at one page by rendering to PDF.

Co-Authored-By: Claude Opus 5 <noreply@anthropic.com>
Claude-Session: https://claude.ai/code/session_01Qg3JRFT9ga3f5zZUMD22tQ
</commit_message>
<xml_diff>
--- a/dist/Jessie-Chan-CV-kraken-qa-ops.docx
+++ b/dist/Jessie-Chan-CV-kraken-qa-ops.docx
@@ -52,7 +52,7 @@
           <w:sz w:val="20"/>
           <w:szCs w:val="20"/>
         </w:rPr>
-        <w:t xml:space="preserve">Marketing operations specialist who runs AI systems and builds with them. I have manually done everything an AI growth platform automates — building audiences, writing copy, moving budget, scheduling sends — across 26 markets in a regulated crypto business, so I can tell when the output is wrong and not only when the software is. I use Claude Code and Cursor daily, build MCP and API integrations and internal bots, and have spent weeks finding where models get things wrong. Trained in experimental design and causal inference: 128 structured tests run, 26 campaigns cut on the evidence.</w:t>
+        <w:t xml:space="preserve">Growth marketer who runs AI systems and builds with them. I have manually done everything an AI growth platform automates, from building audiences and writing copy to moving budget and scheduling sends, across 26 markets in regulated crypto. I use Claude Code and Cursor daily, build MCP and API integrations, and spend time finding where models get things wrong. Experienced in structured testing and regulated messaging review, with a data-science research background.</w:t>
       </w:r>
     </w:p>
     <w:p>
@@ -155,7 +155,7 @@
           <w:sz w:val="20"/>
           <w:szCs w:val="20"/>
         </w:rPr>
-        <w:t xml:space="preserve">Designed and ran 128 structured tests across 26 markets, defining what each would prove, which segments it covered and when to stop it; identified 5 scalable campaign groups and cut 26 that failed their criteria</w:t>
+        <w:t xml:space="preserve">Ran 128 structured campaign tests across 26 countries, identifying 5 scalable campaign groups and reallocating budget away from 26 underperforming campaigns</w:t>
       </w:r>
     </w:p>
     <w:p>
@@ -177,7 +177,7 @@
           <w:sz w:val="20"/>
           <w:szCs w:val="20"/>
         </w:rPr>
-        <w:t xml:space="preserve">Evaluated 6 AI model providers across avatar, voice, motion and video, then spent ~2 weeks on prompt engineering to find and correct recurring failure modes before any output reached a live ad; reviewed 100+ generated assets against quality and brand standards</w:t>
+        <w:t xml:space="preserve">Evaluated 6 AI model providers and spent 2 weeks on prompt engineering to fix recurring output failures, reviewing 100+ generated assets against brand and compliance standards</w:t>
       </w:r>
     </w:p>
     <w:p>
@@ -199,7 +199,7 @@
           <w:sz w:val="20"/>
           <w:szCs w:val="20"/>
         </w:rPr>
-        <w:t xml:space="preserve">Build with AI daily: automation workflows in Claude Code and Cursor, MCP and API integrations, and internal bots deployed to remove repeat manual work across the team</w:t>
+        <w:t xml:space="preserve">Monitored daily spend and performance across 121 live campaigns in 26 markets, investigating anomalies and escalating what did not reconcile</w:t>
       </w:r>
     </w:p>
     <w:p>
@@ -221,7 +221,7 @@
           <w:sz w:val="20"/>
           <w:szCs w:val="20"/>
         </w:rPr>
-        <w:t xml:space="preserve">Monitored daily performance and spend across 121 live campaigns in 26 markets, investigating anomalies against expected ranges and escalating what did not reconcile. [ADD: one specific error you caught before it cost money — this is the single most persuasive line on the page for this role]</w:t>
+        <w:t xml:space="preserve">Automated daily paid media reporting with Claude Code and Cursor, cutting 30 min/day of manual work, and partnered with Data Engineering and Security to publish it as an internal dashboard</w:t>
       </w:r>
     </w:p>
     <w:p>
@@ -243,7 +243,7 @@
           <w:sz w:val="20"/>
           <w:szCs w:val="20"/>
         </w:rPr>
-        <w:t xml:space="preserve">Reviewed regulated customer-facing messaging across all retail products before release and owned app-store content across 20 storefronts, checking copy against compliance standards in UK, US and EU markets</w:t>
+        <w:t xml:space="preserve">Built MCP and API integrations and internal bots to remove repeat manual work across the team</w:t>
       </w:r>
     </w:p>
     <w:p>
@@ -265,7 +265,7 @@
           <w:sz w:val="20"/>
           <w:szCs w:val="20"/>
         </w:rPr>
-        <w:t xml:space="preserve">Automated daily reporting after evaluating 4 implementation approaches, cutting 30 min/day of manual work, and partnered with Data Engineering and Security to publish it as an internal dashboard. [ADD: did you reconcile the dashboard figures against source data before launch? That is QA on a software product and should say so]</w:t>
+        <w:t xml:space="preserve">Reviewed regulated customer-facing messaging across all retail products and owned app-store content across 20 storefronts in UK, US and EU markets</w:t>
       </w:r>
     </w:p>
     <w:p>
@@ -287,7 +287,7 @@
           <w:sz w:val="20"/>
           <w:szCs w:val="20"/>
         </w:rPr>
-        <w:t xml:space="preserve">Ran paid, creative and lifecycle delivery across 5 channels and 26 markets, scaling installs ~3x at flat CPI while directing 30+ creative briefs and 40 ads</w:t>
+        <w:t xml:space="preserve">Developed an AI-powered UGC production workflow, delivering 100+ video assets and cutting production time by 75%</w:t>
       </w:r>
     </w:p>
     <w:p>
@@ -370,7 +370,7 @@
           <w:sz w:val="20"/>
           <w:szCs w:val="20"/>
         </w:rPr>
-        <w:t xml:space="preserve">Led weekly content reviews with Compliance, working a review queue to clear regulated consumer-finance messaging across every customer-facing channel</w:t>
+        <w:t xml:space="preserve">Led weekly content reviews with Compliance to clear regulated consumer-finance messaging across all channels</w:t>
       </w:r>
     </w:p>
     <w:p>
@@ -392,7 +392,7 @@
           <w:sz w:val="20"/>
           <w:szCs w:val="20"/>
         </w:rPr>
-        <w:t xml:space="preserve">Built a company-wide automated reporting pipeline on lead conversion, cutting daily report preparation from 30 min to almost immediate output and giving the team one consistent source for the numbers</w:t>
+        <w:t xml:space="preserve">Built a company-wide automated reporting pipeline on lead conversion, cutting daily report preparation from 30+ min to almost immediate output</w:t>
       </w:r>
     </w:p>
     <w:p>
@@ -414,7 +414,7 @@
           <w:sz w:val="20"/>
           <w:szCs w:val="20"/>
         </w:rPr>
-        <w:t xml:space="preserve">Ran funnel and lifecycle analysis in Power BI, Excel and Microsoft Clarity to find where users dropped out, then rebuilt the pages responsible; daily conversions rose from 10 to 50+ (5x) with funnel progression up 5%</w:t>
+        <w:t xml:space="preserve">Increased daily conversions from 10 to 50+ (5x) by rebuilding landing and promotional pages in Figma and Photoshop, informed by funnel analysis in Power BI, Excel and Microsoft Clarity</w:t>
       </w:r>
     </w:p>
     <w:p>
@@ -436,7 +436,7 @@
           <w:sz w:val="20"/>
           <w:szCs w:val="20"/>
         </w:rPr>
-        <w:t xml:space="preserve">Managed £50k+ monthly paid budget with full accountability for efficiency, sustaining 120% ROAS</w:t>
+        <w:t xml:space="preserve">Managed £50k+ monthly paid budget managing ads and conversion funnels, sustaining 120% ROAS</w:t>
       </w:r>
     </w:p>
     <w:p>
@@ -517,7 +517,7 @@
           <w:sz w:val="20"/>
           <w:szCs w:val="20"/>
         </w:rPr>
-        <w:t xml:space="preserve">High Distinction. Experimental design, causal inference and statistical analysis in R. Research project graded 86/100, highest in the cohort.</w:t>
+        <w:t xml:space="preserve">High Distinction. Experimental design, causal inference and statistical analysis in R.</w:t>
       </w:r>
     </w:p>
     <w:p>
@@ -610,55 +610,55 @@
           <w:sz w:val="20"/>
           <w:szCs w:val="20"/>
         </w:rPr>
-        <w:t xml:space="preserve">Daily use across generation and analysis, prompt engineering and output quality control, evaluation of 6 model providers, automation workflows (Claude Code, Cursor), MCP and API integrations (Windsor.ai), vibe-coded apps and bots (deployed on fly.io), tools: Runway, Jitter, Gemini, Seedance, Wan, Seeaudio, ElevenLabs; </w:t>
-      </w:r>
-      <w:r>
-        <w:rPr>
-          <w:rFonts w:ascii="Calibri" w:cs="Calibri" w:eastAsia="Calibri" w:hAnsi="Calibri"/>
-          <w:b/>
-          <w:bCs/>
-          <w:i w:val="false"/>
-          <w:iCs w:val="false"/>
-          <w:sz w:val="20"/>
-          <w:szCs w:val="20"/>
-        </w:rPr>
-        <w:t xml:space="preserve">Testing &amp; operations: </w:t>
-      </w:r>
-      <w:r>
-        <w:rPr>
-          <w:rFonts w:ascii="Calibri" w:cs="Calibri" w:eastAsia="Calibri" w:hAnsi="Calibri"/>
-          <w:b w:val="false"/>
-          <w:bCs w:val="false"/>
-          <w:i w:val="false"/>
-          <w:iCs w:val="false"/>
-          <w:sz w:val="20"/>
-          <w:szCs w:val="20"/>
-        </w:rPr>
-        <w:t xml:space="preserve">Structured test design and experimental method, edge-case enumeration, review and approval queues, written documentation and process notes, working to compliance standards with Legal and Compliance, multi-market and multi-language delivery. [ADD: Jira, Linear or any issue tracker you have used, even lightly — a named nice-to-have]; </w:t>
-      </w:r>
-      <w:r>
-        <w:rPr>
-          <w:rFonts w:ascii="Calibri" w:cs="Calibri" w:eastAsia="Calibri" w:hAnsi="Calibri"/>
-          <w:b/>
-          <w:bCs/>
-          <w:i w:val="false"/>
-          <w:iCs w:val="false"/>
-          <w:sz w:val="20"/>
-          <w:szCs w:val="20"/>
-        </w:rPr>
-        <w:t xml:space="preserve">Data: </w:t>
-      </w:r>
-      <w:r>
-        <w:rPr>
-          <w:rFonts w:ascii="Calibri" w:cs="Calibri" w:eastAsia="Calibri" w:hAnsi="Calibri"/>
-          <w:b w:val="false"/>
-          <w:bCs w:val="false"/>
-          <w:i w:val="false"/>
-          <w:iCs w:val="false"/>
-          <w:sz w:val="20"/>
-          <w:szCs w:val="20"/>
-        </w:rPr>
-        <w:t xml:space="preserve">Funnel and cohort analysis, anomaly investigation, automated reporting pipelines, Power BI, Excel, Microsoft Clarity, SQL, R, Python. [ADD: Mixpanel or Amplitude if you have touched either]; </w:t>
+        <w:t xml:space="preserve">Prompt engineering and output quality control, evaluation of 6 model providers, automation workflows (Claude Code, Cursor), MCP and API integrations (Windsor.ai), vibe-coded apps and bots (deployed on fly.io), AI UGC workflow design (avatar, voice, motion, video), tools: Runway, Jitter, Gemini, Seedance, Wan, Seeaudio, ElevenLabs; </w:t>
+      </w:r>
+      <w:r>
+        <w:rPr>
+          <w:rFonts w:ascii="Calibri" w:cs="Calibri" w:eastAsia="Calibri" w:hAnsi="Calibri"/>
+          <w:b/>
+          <w:bCs/>
+          <w:i w:val="false"/>
+          <w:iCs w:val="false"/>
+          <w:sz w:val="20"/>
+          <w:szCs w:val="20"/>
+        </w:rPr>
+        <w:t xml:space="preserve">Testing &amp; measurement: </w:t>
+      </w:r>
+      <w:r>
+        <w:rPr>
+          <w:rFonts w:ascii="Calibri" w:cs="Calibri" w:eastAsia="Calibri" w:hAnsi="Calibri"/>
+          <w:b w:val="false"/>
+          <w:bCs w:val="false"/>
+          <w:i w:val="false"/>
+          <w:iCs w:val="false"/>
+          <w:sz w:val="20"/>
+          <w:szCs w:val="20"/>
+        </w:rPr>
+        <w:t xml:space="preserve">Structured and experimental test design, edge-case enumeration, review and approval queues, test and process documentation, anomaly investigation, funnel and cohort analysis, survey design and segmentation, Power BI, Excel, Microsoft Clarity, R, Python, SQL; </w:t>
+      </w:r>
+      <w:r>
+        <w:rPr>
+          <w:rFonts w:ascii="Calibri" w:cs="Calibri" w:eastAsia="Calibri" w:hAnsi="Calibri"/>
+          <w:b/>
+          <w:bCs/>
+          <w:i w:val="false"/>
+          <w:iCs w:val="false"/>
+          <w:sz w:val="20"/>
+          <w:szCs w:val="20"/>
+        </w:rPr>
+        <w:t xml:space="preserve">Operations: </w:t>
+      </w:r>
+      <w:r>
+        <w:rPr>
+          <w:rFonts w:ascii="Calibri" w:cs="Calibri" w:eastAsia="Calibri" w:hAnsi="Calibri"/>
+          <w:b w:val="false"/>
+          <w:bCs w:val="false"/>
+          <w:i w:val="false"/>
+          <w:iCs w:val="false"/>
+          <w:sz w:val="20"/>
+          <w:szCs w:val="20"/>
+        </w:rPr>
+        <w:t xml:space="preserve">Multi-market and multi-language delivery across 26 countries, regulated messaging review with Compliance, app-store content standards across 20 storefronts, cross-functional work with Data Engineering, Security and Front-End; </w:t>
       </w:r>
       <w:r>
         <w:rPr>
@@ -682,7 +682,7 @@
           <w:sz w:val="20"/>
           <w:szCs w:val="20"/>
         </w:rPr>
-        <w:t xml:space="preserve">Paid media (Apple Search Ads, Google Ads, Meta, TikTok, LinkedIn), lifecycle and creative production, ASO and Custom Product Page, international campaign structure, competitor research (Appfollow), Figma, Photoshop; </w:t>
+        <w:t xml:space="preserve">Apple Search Ads, Google Ads, Meta, TikTok, LinkedIn, ASO and Custom Product Page, international campaign structure, creative testing and budget allocation, competitor research (Appfollow), creative briefing and direction, Figma, Photoshop; </w:t>
       </w:r>
       <w:r>
         <w:rPr>
@@ -706,7 +706,7 @@
           <w:sz w:val="20"/>
           <w:szCs w:val="20"/>
         </w:rPr>
-        <w:t xml:space="preserve">Digital assets, business psychology, languages; </w:t>
+        <w:t xml:space="preserve">Digital assets, business psychology, languages, martial arts, weightlifting; </w:t>
       </w:r>
       <w:r>
         <w:rPr>

</xml_diff>